<commit_message>
osworld: fix g9 replication bug, add closed-book/verify-replan harness, rerun affected sonnet5 tasks
Fixes a bug affecting g9 replication validity in osworld_eval.py and reruns
the subset of sonnet5 and verify-replan tasks affected by the fix and by
infra/rate-limit failures (113 of 303 task directories touched; legacy
pre-fix runs kept alongside for comparison). Adds the closed-book runner
and the codex_loop core module with tests, plus integration plans for the
longhorizon and verify-replan harnesses.
</commit_message>
<xml_diff>
--- a/benchmarks/osworld/results/agent_computer_sonnet5/00fa164e-2612-4439-992e-157d019a8436/run_1/awe_desk_env.docx
+++ b/benchmarks/osworld/results/agent_computer_sonnet5/00fa164e-2612-4439-992e-157d019a8436/run_1/awe_desk_env.docx
@@ -852,10 +852,7 @@
     </w:tbl>
     <w:p>
       <w:pPr>
-        <w:pStyle w:val="TextBody"/>
-        <w:bidi w:val="0"/>
-        <w:ind w:start="0" w:hanging="0"/>
-        <w:jc w:val="start"/>
+        <w:pStyle w:val="Normal"/>
         <w:rPr/>
       </w:pPr>
       <w:r>

</xml_diff>